<commit_message>
Record the division of work in the minutes and fit each to two pages
</commit_message>
<xml_diff>
--- a/minutes/Minute-01.docx
+++ b/minutes/Minute-01.docx
@@ -73,7 +73,7 @@
               <w:rPr>
                 <w:rFonts w:eastAsia="Aptos"/>
                 <w:bCs/>
-                <w:sz w:val="22"/>
+                <w:sz w:val="20"/>
                 <w:szCs w:val="22"/>
               </w:rPr>
               <w:t>PROJECT NAME:</w:t>
@@ -103,7 +103,7 @@
               <w:rPr>
                 <w:rFonts w:eastAsia="Aptos"/>
                 <w:bCs/>
-                <w:sz w:val="22"/>
+                <w:sz w:val="20"/>
                 <w:szCs w:val="22"/>
               </w:rPr>
               <w:t>Plagiarism Detector</w:t>
@@ -159,7 +159,7 @@
               <w:rPr>
                 <w:rFonts w:eastAsia="Aptos"/>
                 <w:bCs/>
-                <w:sz w:val="22"/>
+                <w:sz w:val="20"/>
                 <w:szCs w:val="22"/>
               </w:rPr>
               <w:t>SUPERVISOR:</w:t>
@@ -189,7 +189,7 @@
               <w:rPr>
                 <w:rFonts w:eastAsia="Aptos"/>
                 <w:bCs/>
-                <w:sz w:val="22"/>
+                <w:sz w:val="20"/>
                 <w:szCs w:val="22"/>
               </w:rPr>
               <w:t>Er. Prativa Ny</w:t>
@@ -198,7 +198,7 @@
               <w:rPr>
                 <w:rFonts w:eastAsia="Aptos"/>
                 <w:bCs/>
-                <w:sz w:val="22"/>
+                <w:sz w:val="20"/>
                 <w:szCs w:val="22"/>
               </w:rPr>
               <w:t>a</w:t>
@@ -207,7 +207,7 @@
               <w:rPr>
                 <w:rFonts w:eastAsia="Aptos"/>
                 <w:bCs/>
-                <w:sz w:val="22"/>
+                <w:sz w:val="20"/>
                 <w:szCs w:val="22"/>
               </w:rPr>
               <w:t>upane</w:t>
@@ -263,7 +263,7 @@
               <w:rPr>
                 <w:rFonts w:eastAsia="Aptos"/>
                 <w:bCs/>
-                <w:sz w:val="22"/>
+                <w:sz w:val="20"/>
                 <w:szCs w:val="22"/>
               </w:rPr>
               <w:t>TEAM LEADER (TL):</w:t>
@@ -293,7 +293,7 @@
               <w:rPr>
                 <w:rFonts w:eastAsia="Aptos"/>
                 <w:bCs/>
-                <w:sz w:val="22"/>
+                <w:sz w:val="20"/>
                 <w:szCs w:val="22"/>
               </w:rPr>
               <w:t>Neon Neupane</w:t>
@@ -349,7 +349,7 @@
               <w:rPr>
                 <w:rFonts w:eastAsia="Aptos"/>
                 <w:bCs/>
-                <w:sz w:val="22"/>
+                <w:sz w:val="20"/>
                 <w:szCs w:val="22"/>
               </w:rPr>
               <w:t>MEMBER(M1):</w:t>
@@ -379,7 +379,7 @@
               <w:rPr>
                 <w:rFonts w:eastAsia="Aptos"/>
                 <w:bCs/>
-                <w:sz w:val="22"/>
+                <w:sz w:val="20"/>
                 <w:szCs w:val="22"/>
               </w:rPr>
               <w:t>Bishal Acharya</w:t>
@@ -435,7 +435,7 @@
               <w:rPr>
                 <w:rFonts w:eastAsia="Aptos"/>
                 <w:bCs/>
-                <w:sz w:val="22"/>
+                <w:sz w:val="20"/>
                 <w:szCs w:val="22"/>
               </w:rPr>
               <w:t>MEMBER(M2):</w:t>
@@ -465,7 +465,7 @@
               <w:rPr>
                 <w:rFonts w:eastAsia="Aptos"/>
                 <w:bCs/>
-                <w:sz w:val="22"/>
+                <w:sz w:val="20"/>
                 <w:szCs w:val="22"/>
               </w:rPr>
               <w:t>Nabin Giri</w:t>
@@ -521,7 +521,7 @@
               <w:rPr>
                 <w:rFonts w:eastAsia="Aptos"/>
                 <w:bCs/>
-                <w:sz w:val="22"/>
+                <w:sz w:val="20"/>
                 <w:szCs w:val="22"/>
               </w:rPr>
               <w:t>PROGRESS CHECK:</w:t>
@@ -550,7 +550,7 @@
             <w:r>
               <w:rPr>
                 <w:rFonts w:eastAsia="Aptos"/>
-                <w:sz w:val="22"/>
+                <w:sz w:val="20"/>
                 <w:szCs w:val="22"/>
               </w:rPr>
               <w:t>(Tick ✓ in appropriate box)</w:t>
@@ -632,7 +632,7 @@
                 <w:rFonts w:asciiTheme="majorHAnsi" w:eastAsia="Aptos" w:hAnsiTheme="majorHAnsi" w:cstheme="majorHAnsi"/>
                 <w:b/>
                 <w:bCs/>
-                <w:sz w:val="22"/>
+                <w:sz w:val="20"/>
                 <w:szCs w:val="22"/>
               </w:rPr>
               <w:t>_________________________________________________________</w:t>
@@ -651,7 +651,7 @@
             <w:r>
               <w:rPr>
                 <w:rFonts w:asciiTheme="majorHAnsi" w:eastAsia="Aptos" w:hAnsiTheme="majorHAnsi" w:cstheme="majorHAnsi"/>
-                <w:sz w:val="22"/>
+                <w:sz w:val="20"/>
                 <w:szCs w:val="22"/>
               </w:rPr>
               <w:t xml:space="preserve">     </w:t>
@@ -661,7 +661,7 @@
                 <w:rFonts w:asciiTheme="majorHAnsi" w:eastAsia="Aptos" w:hAnsiTheme="majorHAnsi" w:cstheme="majorHAnsi"/>
                 <w:b/>
                 <w:bCs/>
-                <w:sz w:val="22"/>
+                <w:sz w:val="20"/>
                 <w:szCs w:val="22"/>
               </w:rPr>
               <w:t>[ ]</w:t>
@@ -669,7 +669,7 @@
             <w:r>
               <w:rPr>
                 <w:rFonts w:asciiTheme="majorHAnsi" w:eastAsia="Aptos" w:hAnsiTheme="majorHAnsi" w:cstheme="majorHAnsi"/>
-                <w:sz w:val="22"/>
+                <w:sz w:val="20"/>
                 <w:szCs w:val="22"/>
               </w:rPr>
               <w:t xml:space="preserve"> 5 </w:t>
@@ -679,7 +679,7 @@
                 <w:rFonts w:asciiTheme="majorHAnsi" w:eastAsia="Aptos" w:hAnsiTheme="majorHAnsi" w:cstheme="majorHAnsi"/>
                 <w:b/>
                 <w:bCs/>
-                <w:sz w:val="22"/>
+                <w:sz w:val="20"/>
                 <w:szCs w:val="22"/>
               </w:rPr>
               <w:t>[ ]</w:t>
@@ -687,7 +687,7 @@
             <w:r>
               <w:rPr>
                 <w:rFonts w:asciiTheme="majorHAnsi" w:eastAsia="Aptos" w:hAnsiTheme="majorHAnsi" w:cstheme="majorHAnsi"/>
-                <w:sz w:val="22"/>
+                <w:sz w:val="20"/>
                 <w:szCs w:val="22"/>
               </w:rPr>
               <w:t xml:space="preserve"> 10 </w:t>
@@ -697,7 +697,7 @@
                 <w:rFonts w:asciiTheme="majorHAnsi" w:eastAsia="Aptos" w:hAnsiTheme="majorHAnsi" w:cstheme="majorHAnsi"/>
                 <w:b/>
                 <w:bCs/>
-                <w:sz w:val="22"/>
+                <w:sz w:val="20"/>
                 <w:szCs w:val="22"/>
               </w:rPr>
               <w:t>[ ]</w:t>
@@ -705,7 +705,7 @@
             <w:r>
               <w:rPr>
                 <w:rFonts w:asciiTheme="majorHAnsi" w:eastAsia="Aptos" w:hAnsiTheme="majorHAnsi" w:cstheme="majorHAnsi"/>
-                <w:sz w:val="22"/>
+                <w:sz w:val="20"/>
                 <w:szCs w:val="22"/>
               </w:rPr>
               <w:t xml:space="preserve"> 15 </w:t>
@@ -715,7 +715,7 @@
                 <w:rFonts w:asciiTheme="majorHAnsi" w:eastAsia="Aptos" w:hAnsiTheme="majorHAnsi" w:cstheme="majorHAnsi"/>
                 <w:b/>
                 <w:bCs/>
-                <w:sz w:val="22"/>
+                <w:sz w:val="20"/>
                 <w:szCs w:val="22"/>
               </w:rPr>
               <w:t>[ ]</w:t>
@@ -723,7 +723,7 @@
             <w:r>
               <w:rPr>
                 <w:rFonts w:asciiTheme="majorHAnsi" w:eastAsia="Aptos" w:hAnsiTheme="majorHAnsi" w:cstheme="majorHAnsi"/>
-                <w:sz w:val="22"/>
+                <w:sz w:val="20"/>
                 <w:szCs w:val="22"/>
               </w:rPr>
               <w:t xml:space="preserve"> 20 </w:t>
@@ -733,7 +733,7 @@
                 <w:rFonts w:asciiTheme="majorHAnsi" w:eastAsia="Aptos" w:hAnsiTheme="majorHAnsi" w:cstheme="majorHAnsi"/>
                 <w:b/>
                 <w:bCs/>
-                <w:sz w:val="22"/>
+                <w:sz w:val="20"/>
                 <w:szCs w:val="22"/>
               </w:rPr>
               <w:t>[ ]</w:t>
@@ -741,7 +741,7 @@
             <w:r>
               <w:rPr>
                 <w:rFonts w:asciiTheme="majorHAnsi" w:eastAsia="Aptos" w:hAnsiTheme="majorHAnsi" w:cstheme="majorHAnsi"/>
-                <w:sz w:val="22"/>
+                <w:sz w:val="20"/>
                 <w:szCs w:val="22"/>
               </w:rPr>
               <w:t xml:space="preserve"> 25 </w:t>
@@ -751,7 +751,7 @@
                 <w:rFonts w:asciiTheme="majorHAnsi" w:eastAsia="Aptos" w:hAnsiTheme="majorHAnsi" w:cstheme="majorHAnsi"/>
                 <w:b/>
                 <w:bCs/>
-                <w:sz w:val="22"/>
+                <w:sz w:val="20"/>
                 <w:szCs w:val="22"/>
               </w:rPr>
               <w:t>[ ]</w:t>
@@ -759,7 +759,7 @@
             <w:r>
               <w:rPr>
                 <w:rFonts w:asciiTheme="majorHAnsi" w:eastAsia="Aptos" w:hAnsiTheme="majorHAnsi" w:cstheme="majorHAnsi"/>
-                <w:sz w:val="22"/>
+                <w:sz w:val="20"/>
                 <w:szCs w:val="22"/>
               </w:rPr>
               <w:t xml:space="preserve"> 30 </w:t>
@@ -769,7 +769,7 @@
                 <w:rFonts w:asciiTheme="majorHAnsi" w:eastAsia="Aptos" w:hAnsiTheme="majorHAnsi" w:cstheme="majorHAnsi"/>
                 <w:b/>
                 <w:bCs/>
-                <w:sz w:val="22"/>
+                <w:sz w:val="20"/>
                 <w:szCs w:val="22"/>
               </w:rPr>
               <w:t>[ ]</w:t>
@@ -777,7 +777,7 @@
             <w:r>
               <w:rPr>
                 <w:rFonts w:asciiTheme="majorHAnsi" w:eastAsia="Aptos" w:hAnsiTheme="majorHAnsi" w:cstheme="majorHAnsi"/>
-                <w:sz w:val="22"/>
+                <w:sz w:val="20"/>
                 <w:szCs w:val="22"/>
               </w:rPr>
               <w:t xml:space="preserve"> 35 </w:t>
@@ -787,7 +787,7 @@
                 <w:rFonts w:asciiTheme="majorHAnsi" w:eastAsia="Aptos" w:hAnsiTheme="majorHAnsi" w:cstheme="majorHAnsi"/>
                 <w:b/>
                 <w:bCs/>
-                <w:sz w:val="22"/>
+                <w:sz w:val="20"/>
                 <w:szCs w:val="22"/>
               </w:rPr>
               <w:t>[ ]</w:t>
@@ -795,7 +795,7 @@
             <w:r>
               <w:rPr>
                 <w:rFonts w:asciiTheme="majorHAnsi" w:eastAsia="Aptos" w:hAnsiTheme="majorHAnsi" w:cstheme="majorHAnsi"/>
-                <w:sz w:val="22"/>
+                <w:sz w:val="20"/>
                 <w:szCs w:val="22"/>
               </w:rPr>
               <w:t xml:space="preserve"> 40 </w:t>
@@ -805,7 +805,7 @@
                 <w:rFonts w:asciiTheme="majorHAnsi" w:eastAsia="Aptos" w:hAnsiTheme="majorHAnsi" w:cstheme="majorHAnsi"/>
                 <w:b/>
                 <w:bCs/>
-                <w:sz w:val="22"/>
+                <w:sz w:val="20"/>
                 <w:szCs w:val="22"/>
               </w:rPr>
               <w:t>[ ]</w:t>
@@ -813,7 +813,7 @@
             <w:r>
               <w:rPr>
                 <w:rFonts w:asciiTheme="majorHAnsi" w:eastAsia="Aptos" w:hAnsiTheme="majorHAnsi" w:cstheme="majorHAnsi"/>
-                <w:sz w:val="22"/>
+                <w:sz w:val="20"/>
                 <w:szCs w:val="22"/>
               </w:rPr>
               <w:t xml:space="preserve"> 45 </w:t>
@@ -823,7 +823,7 @@
                 <w:rFonts w:asciiTheme="majorHAnsi" w:eastAsia="Aptos" w:hAnsiTheme="majorHAnsi" w:cstheme="majorHAnsi"/>
                 <w:b/>
                 <w:bCs/>
-                <w:sz w:val="22"/>
+                <w:sz w:val="20"/>
                 <w:szCs w:val="22"/>
               </w:rPr>
               <w:t>[ ]</w:t>
@@ -831,7 +831,7 @@
             <w:r>
               <w:rPr>
                 <w:rFonts w:asciiTheme="majorHAnsi" w:eastAsia="Aptos" w:hAnsiTheme="majorHAnsi" w:cstheme="majorHAnsi"/>
-                <w:sz w:val="22"/>
+                <w:sz w:val="20"/>
                 <w:szCs w:val="22"/>
               </w:rPr>
               <w:t xml:space="preserve"> 50 </w:t>
@@ -841,7 +841,7 @@
                 <w:rFonts w:asciiTheme="majorHAnsi" w:eastAsia="Aptos" w:hAnsiTheme="majorHAnsi" w:cstheme="majorHAnsi"/>
                 <w:b/>
                 <w:bCs/>
-                <w:sz w:val="22"/>
+                <w:sz w:val="20"/>
                 <w:szCs w:val="22"/>
               </w:rPr>
               <w:t>[ ]</w:t>
@@ -849,7 +849,7 @@
             <w:r>
               <w:rPr>
                 <w:rFonts w:asciiTheme="majorHAnsi" w:eastAsia="Aptos" w:hAnsiTheme="majorHAnsi" w:cstheme="majorHAnsi"/>
-                <w:sz w:val="22"/>
+                <w:sz w:val="20"/>
                 <w:szCs w:val="22"/>
               </w:rPr>
               <w:t xml:space="preserve"> 55 </w:t>
@@ -859,7 +859,7 @@
                 <w:rFonts w:asciiTheme="majorHAnsi" w:eastAsia="Aptos" w:hAnsiTheme="majorHAnsi" w:cstheme="majorHAnsi"/>
                 <w:b/>
                 <w:bCs/>
-                <w:sz w:val="22"/>
+                <w:sz w:val="20"/>
                 <w:szCs w:val="22"/>
               </w:rPr>
               <w:t>[ ]</w:t>
@@ -867,7 +867,7 @@
             <w:r>
               <w:rPr>
                 <w:rFonts w:asciiTheme="majorHAnsi" w:eastAsia="Aptos" w:hAnsiTheme="majorHAnsi" w:cstheme="majorHAnsi"/>
-                <w:sz w:val="22"/>
+                <w:sz w:val="20"/>
                 <w:szCs w:val="22"/>
               </w:rPr>
               <w:t xml:space="preserve"> 60 </w:t>
@@ -877,7 +877,7 @@
                 <w:rFonts w:asciiTheme="majorHAnsi" w:eastAsia="Aptos" w:hAnsiTheme="majorHAnsi" w:cstheme="majorHAnsi"/>
                 <w:b/>
                 <w:bCs/>
-                <w:sz w:val="22"/>
+                <w:sz w:val="20"/>
                 <w:szCs w:val="22"/>
               </w:rPr>
               <w:t>[ ]</w:t>
@@ -885,7 +885,7 @@
             <w:r>
               <w:rPr>
                 <w:rFonts w:asciiTheme="majorHAnsi" w:eastAsia="Aptos" w:hAnsiTheme="majorHAnsi" w:cstheme="majorHAnsi"/>
-                <w:sz w:val="22"/>
+                <w:sz w:val="20"/>
                 <w:szCs w:val="22"/>
               </w:rPr>
               <w:t xml:space="preserve"> 65 </w:t>
@@ -895,7 +895,7 @@
                 <w:rFonts w:asciiTheme="majorHAnsi" w:eastAsia="Aptos" w:hAnsiTheme="majorHAnsi" w:cstheme="majorHAnsi"/>
                 <w:b/>
                 <w:bCs/>
-                <w:sz w:val="22"/>
+                <w:sz w:val="20"/>
                 <w:szCs w:val="22"/>
               </w:rPr>
               <w:t>[ ]</w:t>
@@ -903,7 +903,7 @@
             <w:r>
               <w:rPr>
                 <w:rFonts w:asciiTheme="majorHAnsi" w:eastAsia="Aptos" w:hAnsiTheme="majorHAnsi" w:cstheme="majorHAnsi"/>
-                <w:sz w:val="22"/>
+                <w:sz w:val="20"/>
                 <w:szCs w:val="22"/>
               </w:rPr>
               <w:t xml:space="preserve"> 70 </w:t>
@@ -913,7 +913,7 @@
                 <w:rFonts w:asciiTheme="majorHAnsi" w:eastAsia="Aptos" w:hAnsiTheme="majorHAnsi" w:cstheme="majorHAnsi"/>
                 <w:b/>
                 <w:bCs/>
-                <w:sz w:val="22"/>
+                <w:sz w:val="20"/>
                 <w:szCs w:val="22"/>
               </w:rPr>
               <w:t>[ ]</w:t>
@@ -921,7 +921,7 @@
             <w:r>
               <w:rPr>
                 <w:rFonts w:asciiTheme="majorHAnsi" w:eastAsia="Aptos" w:hAnsiTheme="majorHAnsi" w:cstheme="majorHAnsi"/>
-                <w:sz w:val="22"/>
+                <w:sz w:val="20"/>
                 <w:szCs w:val="22"/>
               </w:rPr>
               <w:t xml:space="preserve"> 75 </w:t>
@@ -931,7 +931,7 @@
                 <w:rFonts w:asciiTheme="majorHAnsi" w:eastAsia="Aptos" w:hAnsiTheme="majorHAnsi" w:cstheme="majorHAnsi"/>
                 <w:b/>
                 <w:bCs/>
-                <w:sz w:val="22"/>
+                <w:sz w:val="20"/>
                 <w:szCs w:val="22"/>
               </w:rPr>
               <w:t>[ ]</w:t>
@@ -939,7 +939,7 @@
             <w:r>
               <w:rPr>
                 <w:rFonts w:asciiTheme="majorHAnsi" w:eastAsia="Aptos" w:hAnsiTheme="majorHAnsi" w:cstheme="majorHAnsi"/>
-                <w:sz w:val="22"/>
+                <w:sz w:val="20"/>
                 <w:szCs w:val="22"/>
               </w:rPr>
               <w:t xml:space="preserve"> 80 </w:t>
@@ -949,7 +949,7 @@
                 <w:rFonts w:asciiTheme="majorHAnsi" w:eastAsia="Aptos" w:hAnsiTheme="majorHAnsi" w:cstheme="majorHAnsi"/>
                 <w:b/>
                 <w:bCs/>
-                <w:sz w:val="22"/>
+                <w:sz w:val="20"/>
                 <w:szCs w:val="22"/>
               </w:rPr>
               <w:t>[ ]</w:t>
@@ -957,7 +957,7 @@
             <w:r>
               <w:rPr>
                 <w:rFonts w:asciiTheme="majorHAnsi" w:eastAsia="Aptos" w:hAnsiTheme="majorHAnsi" w:cstheme="majorHAnsi"/>
-                <w:sz w:val="22"/>
+                <w:sz w:val="20"/>
                 <w:szCs w:val="22"/>
               </w:rPr>
               <w:t xml:space="preserve"> 85 </w:t>
@@ -967,7 +967,7 @@
                 <w:rFonts w:asciiTheme="majorHAnsi" w:eastAsia="Aptos" w:hAnsiTheme="majorHAnsi" w:cstheme="majorHAnsi"/>
                 <w:b/>
                 <w:bCs/>
-                <w:sz w:val="22"/>
+                <w:sz w:val="20"/>
                 <w:szCs w:val="22"/>
               </w:rPr>
               <w:t>[ ]</w:t>
@@ -975,7 +975,7 @@
             <w:r>
               <w:rPr>
                 <w:rFonts w:asciiTheme="majorHAnsi" w:eastAsia="Aptos" w:hAnsiTheme="majorHAnsi" w:cstheme="majorHAnsi"/>
-                <w:sz w:val="22"/>
+                <w:sz w:val="20"/>
                 <w:szCs w:val="22"/>
               </w:rPr>
               <w:t xml:space="preserve"> 90 </w:t>
@@ -985,7 +985,7 @@
                 <w:rFonts w:asciiTheme="majorHAnsi" w:eastAsia="Aptos" w:hAnsiTheme="majorHAnsi" w:cstheme="majorHAnsi"/>
                 <w:b/>
                 <w:bCs/>
-                <w:sz w:val="22"/>
+                <w:sz w:val="20"/>
                 <w:szCs w:val="22"/>
               </w:rPr>
               <w:t>[ ]</w:t>
@@ -993,7 +993,7 @@
             <w:r>
               <w:rPr>
                 <w:rFonts w:asciiTheme="majorHAnsi" w:eastAsia="Aptos" w:hAnsiTheme="majorHAnsi" w:cstheme="majorHAnsi"/>
-                <w:sz w:val="22"/>
+                <w:sz w:val="20"/>
                 <w:szCs w:val="22"/>
               </w:rPr>
               <w:t xml:space="preserve"> 95 </w:t>
@@ -1003,7 +1003,7 @@
                 <w:rFonts w:asciiTheme="majorHAnsi" w:eastAsia="Aptos" w:hAnsiTheme="majorHAnsi" w:cstheme="majorHAnsi"/>
                 <w:b/>
                 <w:bCs/>
-                <w:sz w:val="22"/>
+                <w:sz w:val="20"/>
                 <w:szCs w:val="22"/>
               </w:rPr>
               <w:t>[ ]</w:t>
@@ -1011,7 +1011,7 @@
             <w:r>
               <w:rPr>
                 <w:rFonts w:asciiTheme="majorHAnsi" w:eastAsia="Aptos" w:hAnsiTheme="majorHAnsi" w:cstheme="majorHAnsi"/>
-                <w:sz w:val="22"/>
+                <w:sz w:val="20"/>
                 <w:szCs w:val="22"/>
               </w:rPr>
               <w:t> 100</w:t>
@@ -1056,7 +1056,7 @@
               <w:rPr>
                 <w:rFonts w:eastAsia="Aptos"/>
                 <w:bCs/>
-                <w:sz w:val="22"/>
+                <w:sz w:val="20"/>
                 <w:szCs w:val="22"/>
               </w:rPr>
               <w:t>AGENDA:</w:t>
@@ -1091,7 +1091,7 @@
               <w:rPr>
                 <w:rFonts w:eastAsia="Aptos"/>
                 <w:bCs/>
-                <w:sz w:val="22"/>
+                <w:sz w:val="20"/>
                 <w:szCs w:val="22"/>
                 <w:lang w:val="en-US"/>
               </w:rPr>
@@ -1116,7 +1116,7 @@
               <w:rPr>
                 <w:rFonts w:eastAsia="Aptos"/>
                 <w:bCs/>
-                <w:sz w:val="22"/>
+                <w:sz w:val="20"/>
                 <w:szCs w:val="22"/>
                 <w:lang w:val="en-US"/>
               </w:rPr>
@@ -1141,7 +1141,7 @@
               <w:rPr>
                 <w:rFonts w:eastAsia="Aptos"/>
                 <w:bCs/>
-                <w:sz w:val="22"/>
+                <w:sz w:val="20"/>
                 <w:szCs w:val="22"/>
                 <w:lang w:val="en-US"/>
               </w:rPr>
@@ -1166,7 +1166,7 @@
               <w:rPr>
                 <w:rFonts w:eastAsia="Aptos"/>
                 <w:bCs/>
-                <w:sz w:val="22"/>
+                <w:sz w:val="20"/>
                 <w:szCs w:val="22"/>
                 <w:lang w:val="en-US"/>
               </w:rPr>
@@ -1223,7 +1223,7 @@
               <w:rPr>
                 <w:rFonts w:eastAsia="Aptos"/>
                 <w:bCs/>
-                <w:sz w:val="22"/>
+                <w:sz w:val="20"/>
                 <w:szCs w:val="22"/>
               </w:rPr>
               <w:t>DISCUSSION:</w:t>
@@ -1253,7 +1253,7 @@
               <w:rPr>
                 <w:rFonts w:eastAsia="Aptos"/>
                 <w:bCs/>
-                <w:sz w:val="22"/>
+                <w:sz w:val="20"/>
                 <w:szCs w:val="22"/>
               </w:rPr>
               <w:t>The topic has already been approved, so this meeting was used to decide how the system will actually be built. The team explained the problem once more for the record. The tools used at present, such as Turnitin and Quetext, are either paid or limited to institutions, and the free ones compare words only, so a few changed words are enough to defeat them. The system will therefore compare the meaning of sentences instead of their words. The scope was frozen to two checks, that is, comparing a batch of submitted documents against each other and comparing one document against public web pages, and the supported formats were fixed as PDF, DOCX, TXT and scanned images. It was decided that no uploaded file will be stored, because the privacy of the student is one of the stated objectives. The system was divided into five parts, namely text extraction, preprocessing, similarity calculation, web checking and highlighting, so that each part can be built and tested on its own. The supervisor accepted the division, warned the team not to widen the scope in the middle of the semester, and asked that the dataset and the model be settled before any application code is written. The roles were fixed as Neon Neupane for the backend, the machine learning work and the coordination of the team, and Bishal Acharya and Nabin Giri for the frontend and the testing side.</w:t>
@@ -1344,7 +1344,7 @@
               <w:rPr>
                 <w:rFonts w:eastAsia="Aptos"/>
                 <w:bCs/>
-                <w:sz w:val="22"/>
+                <w:sz w:val="20"/>
                 <w:szCs w:val="22"/>
                 <w:u w:val="single"/>
               </w:rPr>
@@ -1372,7 +1372,7 @@
               <w:rPr>
                 <w:rFonts w:eastAsia="Aptos"/>
                 <w:bCs/>
-                <w:sz w:val="22"/>
+                <w:sz w:val="20"/>
                 <w:szCs w:val="22"/>
                 <w:u w:val="single"/>
               </w:rPr>
@@ -1399,7 +1399,7 @@
               <w:rPr>
                 <w:rFonts w:eastAsia="Aptos"/>
                 <w:bCs/>
-                <w:sz w:val="22"/>
+                <w:sz w:val="20"/>
                 <w:szCs w:val="22"/>
                 <w:u w:val="single"/>
               </w:rPr>
@@ -1429,10 +1429,10 @@
               <w:rPr>
                 <w:rFonts w:eastAsia="Aptos"/>
                 <w:bCs/>
-                <w:sz w:val="22"/>
-                <w:szCs w:val="22"/>
-              </w:rPr>
-              <w:t>Studied the working of the existing plagiarism checking tools, compared their pricing, their accuracy and their limitations, and prepared the module wise division of the system that was presented in this meeting.</w:t>
+                <w:sz w:val="20"/>
+                <w:szCs w:val="22"/>
+              </w:rPr>
+              <w:t>Studied the working of the existing plagiarism checking tools, compared their pricing, their accuracy and their limitations, listed the file formats the system must accept and checked how PDF, DOCX and scanned images can be read in Python, and prepared the module wise division of the system that was presented in this meeting.</w:t>
             </w:r>
           </w:p>
         </w:tc>
@@ -1453,34 +1453,34 @@
               <w:rPr>
                 <w:rFonts w:eastAsia="Aptos"/>
                 <w:bCs/>
-                <w:sz w:val="22"/>
+                <w:sz w:val="20"/>
+                <w:szCs w:val="22"/>
+              </w:rPr>
+              <w:t>Compared the way the existing tools decide that two documents match, separated the ones that compare words from the ones that compare meaning, and reported what kind of labelled sentence pairs a model would need in order to see a paraphrase that word matching misses.</w:t>
+            </w:r>
+          </w:p>
+        </w:tc>
+        <w:tc>
+          <w:tcPr>
+            <w:tcW w:w="3091" w:type="dxa"/>
+          </w:tcPr>
+          <w:p>
+            <w:pPr>
+              <w:spacing w:after="0" w:line="240" w:lineRule="auto"/>
+              <w:rPr>
+                <w:bCs/>
+                <w:sz w:val="22"/>
+                <w:szCs w:val="22"/>
+              </w:rPr>
+            </w:pPr>
+            <w:r>
+              <w:rPr>
+                <w:rFonts w:eastAsia="Aptos"/>
+                <w:bCs/>
+                <w:sz w:val="20"/>
                 <w:szCs w:val="22"/>
               </w:rPr>
               <w:t>Collected the requirements from classmates and teachers on how assignments are checked at present, and listed the screens that the application will need, that is, the upload screen, the result screen and the web check screen.</w:t>
-            </w:r>
-          </w:p>
-        </w:tc>
-        <w:tc>
-          <w:tcPr>
-            <w:tcW w:w="3091" w:type="dxa"/>
-          </w:tcPr>
-          <w:p>
-            <w:pPr>
-              <w:spacing w:after="0" w:line="240" w:lineRule="auto"/>
-              <w:rPr>
-                <w:bCs/>
-                <w:sz w:val="22"/>
-                <w:szCs w:val="22"/>
-              </w:rPr>
-            </w:pPr>
-            <w:r>
-              <w:rPr>
-                <w:rFonts w:eastAsia="Aptos"/>
-                <w:bCs/>
-                <w:sz w:val="22"/>
-                <w:szCs w:val="22"/>
-              </w:rPr>
-              <w:t>Listed the file formats that the system must accept and tested how PDF, DOCX and scanned image files can be read in Python, and reported which of them will need optical character recognition.</w:t>
             </w:r>
           </w:p>
         </w:tc>
@@ -1545,7 +1545,7 @@
               <w:rPr>
                 <w:rFonts w:eastAsia="Aptos"/>
                 <w:bCs/>
-                <w:sz w:val="22"/>
+                <w:sz w:val="20"/>
                 <w:szCs w:val="22"/>
                 <w:u w:val="single"/>
               </w:rPr>
@@ -1572,7 +1572,7 @@
               <w:rPr>
                 <w:rFonts w:eastAsia="Aptos"/>
                 <w:bCs/>
-                <w:sz w:val="22"/>
+                <w:sz w:val="20"/>
                 <w:szCs w:val="22"/>
                 <w:u w:val="single"/>
               </w:rPr>
@@ -1599,7 +1599,7 @@
               <w:rPr>
                 <w:rFonts w:eastAsia="Aptos"/>
                 <w:bCs/>
-                <w:sz w:val="22"/>
+                <w:sz w:val="20"/>
                 <w:szCs w:val="22"/>
                 <w:u w:val="single"/>
               </w:rPr>
@@ -1629,10 +1629,10 @@
               <w:rPr>
                 <w:rFonts w:eastAsia="Aptos"/>
                 <w:bCs/>
-                <w:sz w:val="22"/>
-                <w:szCs w:val="22"/>
-              </w:rPr>
-              <w:t>Carry out the review of the text similarity techniques, shortlist the dataset and the model, and prepare the plan document containing the architecture and the processing pipeline.</w:t>
+                <w:sz w:val="20"/>
+                <w:szCs w:val="22"/>
+              </w:rPr>
+              <w:t>Prepare the plan document containing the architecture and the processing pipeline, create the repository, and test the libraries for reading PDF, DOCX and image files together with the available OCR options.</w:t>
             </w:r>
           </w:p>
         </w:tc>
@@ -1653,34 +1653,34 @@
               <w:rPr>
                 <w:rFonts w:eastAsia="Aptos"/>
                 <w:bCs/>
-                <w:sz w:val="22"/>
+                <w:sz w:val="20"/>
+                <w:szCs w:val="22"/>
+              </w:rPr>
+              <w:t>Carry out the review of the text similarity techniques and shortlist the model to be fine tuned, and shortlist the training corpus together with the other two members.</w:t>
+            </w:r>
+          </w:p>
+        </w:tc>
+        <w:tc>
+          <w:tcPr>
+            <w:tcW w:w="3035" w:type="dxa"/>
+          </w:tcPr>
+          <w:p>
+            <w:pPr>
+              <w:spacing w:after="0" w:line="240" w:lineRule="auto"/>
+              <w:rPr>
+                <w:bCs/>
+                <w:sz w:val="22"/>
+                <w:szCs w:val="22"/>
+              </w:rPr>
+            </w:pPr>
+            <w:r>
+              <w:rPr>
+                <w:rFonts w:eastAsia="Aptos"/>
+                <w:bCs/>
+                <w:sz w:val="20"/>
                 <w:szCs w:val="22"/>
               </w:rPr>
               <w:t>Study React and Vite, and prepare the wireframes of the upload screen, the similarity matrix screen and the highlighted result screen.</w:t>
-            </w:r>
-          </w:p>
-        </w:tc>
-        <w:tc>
-          <w:tcPr>
-            <w:tcW w:w="3035" w:type="dxa"/>
-          </w:tcPr>
-          <w:p>
-            <w:pPr>
-              <w:spacing w:after="0" w:line="240" w:lineRule="auto"/>
-              <w:rPr>
-                <w:bCs/>
-                <w:sz w:val="22"/>
-                <w:szCs w:val="22"/>
-              </w:rPr>
-            </w:pPr>
-            <w:r>
-              <w:rPr>
-                <w:rFonts w:eastAsia="Aptos"/>
-                <w:bCs/>
-                <w:sz w:val="22"/>
-                <w:szCs w:val="22"/>
-              </w:rPr>
-              <w:t>Test the libraries for reading PDF, DOCX and image files, compare the output of the available OCR options, and start collecting the sample documents.</w:t>
             </w:r>
           </w:p>
         </w:tc>
@@ -1761,7 +1761,7 @@
               <w:rPr>
                 <w:rFonts w:eastAsia="Aptos"/>
                 <w:bCs/>
-                <w:sz w:val="22"/>
+                <w:sz w:val="20"/>
                 <w:szCs w:val="22"/>
               </w:rPr>
               <w:t>_____________________</w:t>
@@ -1781,7 +1781,7 @@
               <w:rPr>
                 <w:rFonts w:eastAsia="Aptos"/>
                 <w:bCs/>
-                <w:sz w:val="22"/>
+                <w:sz w:val="20"/>
                 <w:szCs w:val="22"/>
               </w:rPr>
               <w:t>MEMBER 1</w:t>
@@ -1812,7 +1812,7 @@
               <w:rPr>
                 <w:rFonts w:eastAsia="Aptos"/>
                 <w:bCs/>
-                <w:sz w:val="22"/>
+                <w:sz w:val="20"/>
                 <w:szCs w:val="22"/>
               </w:rPr>
               <w:t>___________________</w:t>
@@ -1832,7 +1832,7 @@
               <w:rPr>
                 <w:rFonts w:eastAsia="Aptos"/>
                 <w:bCs/>
-                <w:sz w:val="22"/>
+                <w:sz w:val="20"/>
                 <w:szCs w:val="22"/>
               </w:rPr>
               <w:t>MEMBER 2</w:t>
@@ -1863,7 +1863,7 @@
               <w:rPr>
                 <w:rFonts w:eastAsia="Aptos"/>
                 <w:bCs/>
-                <w:sz w:val="22"/>
+                <w:sz w:val="20"/>
                 <w:szCs w:val="22"/>
               </w:rPr>
               <w:t>______________________</w:t>
@@ -1883,7 +1883,7 @@
               <w:rPr>
                 <w:rFonts w:eastAsia="Aptos"/>
                 <w:bCs/>
-                <w:sz w:val="22"/>
+                <w:sz w:val="20"/>
                 <w:szCs w:val="22"/>
               </w:rPr>
               <w:t>TEAM LEADER</w:t>
@@ -1941,7 +1941,7 @@
               <w:rPr>
                 <w:rFonts w:eastAsia="Aptos"/>
                 <w:bCs/>
-                <w:sz w:val="22"/>
+                <w:sz w:val="20"/>
                 <w:szCs w:val="22"/>
               </w:rPr>
               <w:t>___________________</w:t>
@@ -1961,7 +1961,7 @@
               <w:rPr>
                 <w:rFonts w:eastAsia="Aptos"/>
                 <w:bCs/>
-                <w:sz w:val="22"/>
+                <w:sz w:val="20"/>
                 <w:szCs w:val="22"/>
               </w:rPr>
               <w:t>SUPERVISOR</w:t>
@@ -1996,78 +1996,6 @@
       <w:pPr>
         <w:rPr>
           <w:bCs/>
-          <w:sz w:val="22"/>
-          <w:szCs w:val="22"/>
-        </w:rPr>
-      </w:pPr>
-    </w:p>
-    <w:p>
-      <w:pPr>
-        <w:rPr>
-          <w:b/>
-          <w:sz w:val="22"/>
-          <w:szCs w:val="22"/>
-        </w:rPr>
-      </w:pPr>
-      <w:r>
-        <w:rPr>
-          <w:b/>
-          <w:sz w:val="22"/>
-          <w:szCs w:val="22"/>
-        </w:rPr>
-        <w:t>NOTE:</w:t>
-      </w:r>
-    </w:p>
-    <w:p>
-      <w:pPr>
-        <w:rPr>
-          <w:sz w:val="22"/>
-          <w:szCs w:val="22"/>
-        </w:rPr>
-      </w:pPr>
-      <w:r>
-        <w:rPr>
-          <w:sz w:val="22"/>
-          <w:szCs w:val="22"/>
-        </w:rPr>
-        <w:t>Photo (all members &amp; supervisor included) must be attached with this minute during submission.</w:t>
-      </w:r>
-    </w:p>
-    <w:p>
-      <w:pPr>
-        <w:rPr>
-          <w:sz w:val="22"/>
-          <w:szCs w:val="22"/>
-        </w:rPr>
-      </w:pPr>
-    </w:p>
-    <w:p>
-      <w:pPr>
-        <w:rPr>
-          <w:sz w:val="22"/>
-          <w:szCs w:val="22"/>
-        </w:rPr>
-      </w:pPr>
-    </w:p>
-    <w:p>
-      <w:pPr>
-        <w:rPr>
-          <w:sz w:val="22"/>
-          <w:szCs w:val="22"/>
-        </w:rPr>
-      </w:pPr>
-    </w:p>
-    <w:p>
-      <w:pPr>
-        <w:rPr>
-          <w:sz w:val="22"/>
-          <w:szCs w:val="22"/>
-        </w:rPr>
-      </w:pPr>
-    </w:p>
-    <w:p>
-      <w:pPr>
-        <w:rPr>
           <w:sz w:val="22"/>
           <w:szCs w:val="22"/>
         </w:rPr>
@@ -2127,6 +2055,7 @@
             <w:r>
               <w:rPr>
                 <w:noProof/>
+                <w:sz w:val="20"/>
               </w:rPr>
               <w:pict w14:anchorId="2D7B4EBB">
                 <v:roundrect id="Rounded Rectangle 2" o:spid="_x0000_s1026" style="position:absolute;margin-left:-22.65pt;margin-top:-29.55pt;width:491.25pt;height:117pt;z-index:-503316478;visibility:visible;mso-wrap-style:square;mso-wrap-distance-left:.85pt;mso-wrap-distance-top:.8pt;mso-wrap-distance-right:.8pt;mso-wrap-distance-bottom:.85pt;mso-position-horizontal:absolute;mso-position-horizontal-relative:text;mso-position-vertical:absolute;mso-position-vertical-relative:text;v-text-anchor:top" arcsize="10923f" o:gfxdata="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" fillcolor="white [3212]" strokecolor="gray" strokeweight="1.5pt">
@@ -2137,7 +2066,7 @@
             <w:r>
               <w:rPr>
                 <w:rFonts w:eastAsia="Aptos"/>
-                <w:sz w:val="22"/>
+                <w:sz w:val="20"/>
                 <w:szCs w:val="22"/>
               </w:rPr>
               <w:t>INDIVIDUAL MARKING (5):</w:t>
@@ -2166,7 +2095,7 @@
             <w:r>
               <w:rPr>
                 <w:rFonts w:eastAsia="Aptos"/>
-                <w:sz w:val="22"/>
+                <w:sz w:val="20"/>
                 <w:szCs w:val="22"/>
                 <w:u w:val="single"/>
               </w:rPr>
@@ -2191,7 +2120,7 @@
             <w:r>
               <w:rPr>
                 <w:rFonts w:eastAsia="Aptos"/>
-                <w:sz w:val="22"/>
+                <w:sz w:val="20"/>
                 <w:szCs w:val="22"/>
                 <w:u w:val="single"/>
               </w:rPr>
@@ -2216,7 +2145,7 @@
             <w:r>
               <w:rPr>
                 <w:rFonts w:eastAsia="Aptos"/>
-                <w:sz w:val="22"/>
+                <w:sz w:val="20"/>
                 <w:szCs w:val="22"/>
                 <w:u w:val="single"/>
               </w:rPr>
@@ -2282,10 +2211,19 @@
         </w:tc>
       </w:tr>
     </w:tbl>
-    <w:p/>
+    <w:p>
+      <w:pPr>
+        <w:spacing w:before="0" w:after="0" w:line="240" w:lineRule="auto"/>
+      </w:pPr>
+      <w:r>
+        <w:rPr>
+          <w:sz w:val="2"/>
+        </w:rPr>
+      </w:r>
+    </w:p>
     <w:sectPr>
       <w:pgSz w:w="11906" w:h="16838"/>
-      <w:pgMar w:top="1440" w:right="1440" w:bottom="1440" w:left="1440" w:header="0" w:footer="0" w:gutter="0"/>
+      <w:pgMar w:top="864" w:right="1080" w:bottom="864" w:left="1080" w:header="0" w:footer="0" w:gutter="0"/>
       <w:cols w:space="720"/>
       <w:formProt w:val="0"/>
       <w:docGrid w:linePitch="360"/>

</xml_diff>